<commit_message>
Step 3: Upgrade Java Runtime Target - Compile: succeeded
</commit_message>
<xml_diff>
--- a/完整的插件 UI 规范文档.docx
+++ b/完整的插件 UI 规范文档.docx
@@ -81,7 +81,7 @@
       </w:r>
       <w:r>
         <w:rPr>
-          <w:rStyle w:val="5"/>
+          <w:rStyle w:val="6"/>
           <w:rFonts w:hint="default" w:ascii="Segoe UI" w:hAnsi="Segoe UI" w:eastAsia="Segoe UI" w:cs="Segoe UI"/>
           <w:i w:val="0"/>
           <w:iCs w:val="0"/>
@@ -147,6 +147,7 @@
     </w:p>
     <w:tbl>
       <w:tblPr>
+        <w:tblStyle w:val="3"/>
         <w:tblW w:w="0" w:type="auto"/>
         <w:tblInd w:w="0" w:type="dxa"/>
         <w:tblBorders>
@@ -181,12 +182,6 @@
             <w:insideV w:val="none" w:color="auto" w:sz="0" w:space="0"/>
           </w:tblBorders>
           <w:shd w:val="clear" w:color="auto" w:fill="191A1B"/>
-          <w:tblCellMar>
-            <w:top w:w="15" w:type="dxa"/>
-            <w:left w:w="15" w:type="dxa"/>
-            <w:bottom w:w="15" w:type="dxa"/>
-            <w:right w:w="15" w:type="dxa"/>
-          </w:tblCellMar>
         </w:tblPrEx>
         <w:trPr>
           <w:tblHeader/>
@@ -242,7 +237,6 @@
                 <w:kern w:val="0"/>
                 <w:sz w:val="19"/>
                 <w:szCs w:val="19"/>
-                <w:bdr w:val="none" w:color="auto" w:sz="0" w:space="0"/>
                 <w:lang w:val="en-US" w:eastAsia="zh-CN" w:bidi="ar"/>
               </w:rPr>
               <w:t>章节</w:t>
@@ -300,7 +294,6 @@
                 <w:kern w:val="0"/>
                 <w:sz w:val="19"/>
                 <w:szCs w:val="19"/>
-                <w:bdr w:val="none" w:color="auto" w:sz="0" w:space="0"/>
                 <w:lang w:val="en-US" w:eastAsia="zh-CN" w:bidi="ar"/>
               </w:rPr>
               <w:t>内容</w:t>
@@ -318,6 +311,7 @@
             <w:insideH w:val="none" w:color="auto" w:sz="0" w:space="0"/>
             <w:insideV w:val="none" w:color="auto" w:sz="0" w:space="0"/>
           </w:tblBorders>
+          <w:shd w:val="clear" w:color="auto" w:fill="191A1B"/>
           <w:tblCellMar>
             <w:top w:w="15" w:type="dxa"/>
             <w:left w:w="15" w:type="dxa"/>
@@ -372,7 +366,6 @@
                 <w:kern w:val="0"/>
                 <w:sz w:val="19"/>
                 <w:szCs w:val="19"/>
-                <w:bdr w:val="none" w:color="auto" w:sz="0" w:space="0"/>
                 <w:lang w:val="en-US" w:eastAsia="zh-CN" w:bidi="ar"/>
               </w:rPr>
               <w:t>一、设计令牌</w:t>
@@ -426,7 +419,6 @@
                 <w:kern w:val="0"/>
                 <w:sz w:val="19"/>
                 <w:szCs w:val="19"/>
-                <w:bdr w:val="none" w:color="auto" w:sz="0" w:space="0"/>
                 <w:lang w:val="en-US" w:eastAsia="zh-CN" w:bidi="ar"/>
               </w:rPr>
               <w:t>深色/浅色主题的完整 CSS 变量定义</w:t>
@@ -444,6 +436,7 @@
             <w:insideH w:val="none" w:color="auto" w:sz="0" w:space="0"/>
             <w:insideV w:val="none" w:color="auto" w:sz="0" w:space="0"/>
           </w:tblBorders>
+          <w:shd w:val="clear" w:color="auto" w:fill="191A1B"/>
           <w:tblCellMar>
             <w:top w:w="15" w:type="dxa"/>
             <w:left w:w="15" w:type="dxa"/>
@@ -498,7 +491,6 @@
                 <w:kern w:val="0"/>
                 <w:sz w:val="19"/>
                 <w:szCs w:val="19"/>
-                <w:bdr w:val="none" w:color="auto" w:sz="0" w:space="0"/>
                 <w:lang w:val="en-US" w:eastAsia="zh-CN" w:bidi="ar"/>
               </w:rPr>
               <w:t>二、使用方式</w:t>
@@ -552,7 +544,6 @@
                 <w:kern w:val="0"/>
                 <w:sz w:val="19"/>
                 <w:szCs w:val="19"/>
-                <w:bdr w:val="none" w:color="auto" w:sz="0" w:space="0"/>
                 <w:lang w:val="en-US" w:eastAsia="zh-CN" w:bidi="ar"/>
               </w:rPr>
               <w:t>CSS 和 HTML 中的正确/错误用法示例</w:t>
@@ -570,6 +561,7 @@
             <w:insideH w:val="none" w:color="auto" w:sz="0" w:space="0"/>
             <w:insideV w:val="none" w:color="auto" w:sz="0" w:space="0"/>
           </w:tblBorders>
+          <w:shd w:val="clear" w:color="auto" w:fill="191A1B"/>
           <w:tblCellMar>
             <w:top w:w="15" w:type="dxa"/>
             <w:left w:w="15" w:type="dxa"/>
@@ -624,7 +616,6 @@
                 <w:kern w:val="0"/>
                 <w:sz w:val="19"/>
                 <w:szCs w:val="19"/>
-                <w:bdr w:val="none" w:color="auto" w:sz="0" w:space="0"/>
                 <w:lang w:val="en-US" w:eastAsia="zh-CN" w:bidi="ar"/>
               </w:rPr>
               <w:t>三、布局与间距</w:t>
@@ -678,7 +669,6 @@
                 <w:kern w:val="0"/>
                 <w:sz w:val="19"/>
                 <w:szCs w:val="19"/>
-                <w:bdr w:val="none" w:color="auto" w:sz="0" w:space="0"/>
                 <w:lang w:val="en-US" w:eastAsia="zh-CN" w:bidi="ar"/>
               </w:rPr>
               <w:t>最大宽度、卡片、间距系统</w:t>
@@ -696,6 +686,7 @@
             <w:insideH w:val="none" w:color="auto" w:sz="0" w:space="0"/>
             <w:insideV w:val="none" w:color="auto" w:sz="0" w:space="0"/>
           </w:tblBorders>
+          <w:shd w:val="clear" w:color="auto" w:fill="191A1B"/>
           <w:tblCellMar>
             <w:top w:w="15" w:type="dxa"/>
             <w:left w:w="15" w:type="dxa"/>
@@ -750,7 +741,6 @@
                 <w:kern w:val="0"/>
                 <w:sz w:val="19"/>
                 <w:szCs w:val="19"/>
-                <w:bdr w:val="none" w:color="auto" w:sz="0" w:space="0"/>
                 <w:lang w:val="en-US" w:eastAsia="zh-CN" w:bidi="ar"/>
               </w:rPr>
               <w:t>四、字体系统</w:t>
@@ -804,7 +794,6 @@
                 <w:kern w:val="0"/>
                 <w:sz w:val="19"/>
                 <w:szCs w:val="19"/>
-                <w:bdr w:val="none" w:color="auto" w:sz="0" w:space="0"/>
                 <w:lang w:val="en-US" w:eastAsia="zh-CN" w:bidi="ar"/>
               </w:rPr>
               <w:t>字体族、字号层级</w:t>
@@ -877,7 +866,6 @@
                 <w:kern w:val="0"/>
                 <w:sz w:val="19"/>
                 <w:szCs w:val="19"/>
-                <w:bdr w:val="none" w:color="auto" w:sz="0" w:space="0"/>
                 <w:lang w:val="en-US" w:eastAsia="zh-CN" w:bidi="ar"/>
               </w:rPr>
               <w:t>五、组件样式</w:t>
@@ -931,7 +919,6 @@
                 <w:kern w:val="0"/>
                 <w:sz w:val="19"/>
                 <w:szCs w:val="19"/>
-                <w:bdr w:val="none" w:color="auto" w:sz="0" w:space="0"/>
                 <w:lang w:val="en-US" w:eastAsia="zh-CN" w:bidi="ar"/>
               </w:rPr>
               <w:t>按钮、输入框、卡片、徽章、开关</w:t>
@@ -1004,7 +991,6 @@
                 <w:kern w:val="0"/>
                 <w:sz w:val="19"/>
                 <w:szCs w:val="19"/>
-                <w:bdr w:val="none" w:color="auto" w:sz="0" w:space="0"/>
                 <w:lang w:val="en-US" w:eastAsia="zh-CN" w:bidi="ar"/>
               </w:rPr>
               <w:t>六、响应式断点</w:t>
@@ -1058,7 +1044,6 @@
                 <w:kern w:val="0"/>
                 <w:sz w:val="19"/>
                 <w:szCs w:val="19"/>
-                <w:bdr w:val="none" w:color="auto" w:sz="0" w:space="0"/>
                 <w:lang w:val="en-US" w:eastAsia="zh-CN" w:bidi="ar"/>
               </w:rPr>
               <w:t>移动端到极宽屏的适配规则</w:t>
@@ -1076,6 +1061,7 @@
             <w:insideH w:val="none" w:color="auto" w:sz="0" w:space="0"/>
             <w:insideV w:val="none" w:color="auto" w:sz="0" w:space="0"/>
           </w:tblBorders>
+          <w:shd w:val="clear" w:color="auto" w:fill="191A1B"/>
           <w:tblCellMar>
             <w:top w:w="15" w:type="dxa"/>
             <w:left w:w="15" w:type="dxa"/>
@@ -1130,7 +1116,6 @@
                 <w:kern w:val="0"/>
                 <w:sz w:val="19"/>
                 <w:szCs w:val="19"/>
-                <w:bdr w:val="none" w:color="auto" w:sz="0" w:space="0"/>
                 <w:lang w:val="en-US" w:eastAsia="zh-CN" w:bidi="ar"/>
               </w:rPr>
               <w:t>七、主题切换</w:t>
@@ -1184,7 +1169,6 @@
                 <w:kern w:val="0"/>
                 <w:sz w:val="19"/>
                 <w:szCs w:val="19"/>
-                <w:bdr w:val="none" w:color="auto" w:sz="0" w:space="0"/>
                 <w:lang w:val="en-US" w:eastAsia="zh-CN" w:bidi="ar"/>
               </w:rPr>
               <w:t>data-theme 控制 + 动画实现代码</w:t>
@@ -1257,7 +1241,6 @@
                 <w:kern w:val="0"/>
                 <w:sz w:val="19"/>
                 <w:szCs w:val="19"/>
-                <w:bdr w:val="none" w:color="auto" w:sz="0" w:space="0"/>
                 <w:lang w:val="en-US" w:eastAsia="zh-CN" w:bidi="ar"/>
               </w:rPr>
               <w:t>八、通信规范</w:t>
@@ -1311,7 +1294,6 @@
                 <w:kern w:val="0"/>
                 <w:sz w:val="19"/>
                 <w:szCs w:val="19"/>
-                <w:bdr w:val="none" w:color="auto" w:sz="0" w:space="0"/>
                 <w:lang w:val="en-US" w:eastAsia="zh-CN" w:bidi="ar"/>
               </w:rPr>
               <w:t>postMessage 消息类型定义</w:t>
@@ -1329,6 +1311,7 @@
             <w:insideH w:val="none" w:color="auto" w:sz="0" w:space="0"/>
             <w:insideV w:val="none" w:color="auto" w:sz="0" w:space="0"/>
           </w:tblBorders>
+          <w:shd w:val="clear" w:color="auto" w:fill="191A1B"/>
           <w:tblCellMar>
             <w:top w:w="15" w:type="dxa"/>
             <w:left w:w="15" w:type="dxa"/>
@@ -1383,7 +1366,6 @@
                 <w:kern w:val="0"/>
                 <w:sz w:val="19"/>
                 <w:szCs w:val="19"/>
-                <w:bdr w:val="none" w:color="auto" w:sz="0" w:space="0"/>
                 <w:lang w:val="en-US" w:eastAsia="zh-CN" w:bidi="ar"/>
               </w:rPr>
               <w:t>九、插件样板</w:t>
@@ -1437,7 +1419,6 @@
                 <w:kern w:val="0"/>
                 <w:sz w:val="19"/>
                 <w:szCs w:val="19"/>
-                <w:bdr w:val="none" w:color="auto" w:sz="0" w:space="0"/>
                 <w:lang w:val="en-US" w:eastAsia="zh-CN" w:bidi="ar"/>
               </w:rPr>
               <w:t>HTML/React/Vue 三种模板</w:t>
@@ -1455,6 +1436,7 @@
             <w:insideH w:val="none" w:color="auto" w:sz="0" w:space="0"/>
             <w:insideV w:val="none" w:color="auto" w:sz="0" w:space="0"/>
           </w:tblBorders>
+          <w:shd w:val="clear" w:color="auto" w:fill="191A1B"/>
           <w:tblCellMar>
             <w:top w:w="15" w:type="dxa"/>
             <w:left w:w="15" w:type="dxa"/>
@@ -1509,7 +1491,6 @@
                 <w:kern w:val="0"/>
                 <w:sz w:val="19"/>
                 <w:szCs w:val="19"/>
-                <w:bdr w:val="none" w:color="auto" w:sz="0" w:space="0"/>
                 <w:lang w:val="en-US" w:eastAsia="zh-CN" w:bidi="ar"/>
               </w:rPr>
               <w:t>十、强制约束</w:t>
@@ -1563,7 +1544,6 @@
                 <w:kern w:val="0"/>
                 <w:sz w:val="19"/>
                 <w:szCs w:val="19"/>
-                <w:bdr w:val="none" w:color="auto" w:sz="0" w:space="0"/>
                 <w:lang w:val="en-US" w:eastAsia="zh-CN" w:bidi="ar"/>
               </w:rPr>
               <w:t>禁止硬编码、覆盖变量等</w:t>
@@ -1581,6 +1561,7 @@
             <w:insideH w:val="none" w:color="auto" w:sz="0" w:space="0"/>
             <w:insideV w:val="none" w:color="auto" w:sz="0" w:space="0"/>
           </w:tblBorders>
+          <w:shd w:val="clear" w:color="auto" w:fill="191A1B"/>
           <w:tblCellMar>
             <w:top w:w="15" w:type="dxa"/>
             <w:left w:w="15" w:type="dxa"/>
@@ -1635,7 +1616,6 @@
                 <w:kern w:val="0"/>
                 <w:sz w:val="19"/>
                 <w:szCs w:val="19"/>
-                <w:bdr w:val="none" w:color="auto" w:sz="0" w:space="0"/>
                 <w:lang w:val="en-US" w:eastAsia="zh-CN" w:bidi="ar"/>
               </w:rPr>
               <w:t>十一、快速参考表</w:t>
@@ -1689,7 +1669,6 @@
                 <w:kern w:val="0"/>
                 <w:sz w:val="19"/>
                 <w:szCs w:val="19"/>
-                <w:bdr w:val="none" w:color="auto" w:sz="0" w:space="0"/>
                 <w:lang w:val="en-US" w:eastAsia="zh-CN" w:bidi="ar"/>
               </w:rPr>
               <w:t>CSS 变量与 Tailwind 类对照</w:t>
@@ -1707,6 +1686,7 @@
             <w:insideH w:val="none" w:color="auto" w:sz="0" w:space="0"/>
             <w:insideV w:val="none" w:color="auto" w:sz="0" w:space="0"/>
           </w:tblBorders>
+          <w:shd w:val="clear" w:color="auto" w:fill="191A1B"/>
           <w:tblCellMar>
             <w:top w:w="15" w:type="dxa"/>
             <w:left w:w="15" w:type="dxa"/>
@@ -1761,7 +1741,6 @@
                 <w:kern w:val="0"/>
                 <w:sz w:val="19"/>
                 <w:szCs w:val="19"/>
-                <w:bdr w:val="none" w:color="auto" w:sz="0" w:space="0"/>
                 <w:lang w:val="en-US" w:eastAsia="zh-CN" w:bidi="ar"/>
               </w:rPr>
               <w:t>十二、常见问题</w:t>
@@ -1815,7 +1794,6 @@
                 <w:kern w:val="0"/>
                 <w:sz w:val="19"/>
                 <w:szCs w:val="19"/>
-                <w:bdr w:val="none" w:color="auto" w:sz="0" w:space="0"/>
                 <w:lang w:val="en-US" w:eastAsia="zh-CN" w:bidi="ar"/>
               </w:rPr>
               <w:t>FAQ</w:t>
@@ -1863,6 +1841,7 @@
     <w:p>
       <w:pPr>
         <w:numPr>
+          <w:ilvl w:val="0"/>
           <w:numId w:val="0"/>
         </w:numPr>
         <w:rPr>
@@ -1880,6 +1859,7 @@
     <w:p>
       <w:pPr>
         <w:numPr>
+          <w:ilvl w:val="0"/>
           <w:numId w:val="0"/>
         </w:numPr>
         <w:rPr>
@@ -1893,13 +1873,11 @@
           <w:shd w:val="clear" w:fill="202122"/>
         </w:rPr>
       </w:pPr>
-      <w:bookmarkStart w:id="0" w:name="_GoBack"/>
-      <w:bookmarkEnd w:id="0"/>
     </w:p>
     <w:p>
       <w:pPr>
         <w:rPr>
-          <w:rFonts w:ascii="Segoe UI" w:hAnsi="Segoe UI" w:eastAsia="Segoe UI" w:cs="Segoe UI"/>
+          <w:rFonts w:hint="eastAsia" w:ascii="Segoe UI" w:hAnsi="Segoe UI" w:eastAsia="Segoe UI" w:cs="Segoe UI"/>
           <w:i w:val="0"/>
           <w:iCs w:val="0"/>
           <w:caps w:val="0"/>
@@ -1909,6 +1887,441 @@
           <w:shd w:val="clear" w:fill="202122"/>
         </w:rPr>
       </w:pPr>
+      <w:r>
+        <w:rPr>
+          <w:rFonts w:hint="eastAsia" w:ascii="Segoe UI" w:hAnsi="Segoe UI" w:eastAsia="Segoe UI" w:cs="Segoe UI"/>
+          <w:i w:val="0"/>
+          <w:iCs w:val="0"/>
+          <w:caps w:val="0"/>
+          <w:spacing w:val="0"/>
+          <w:sz w:val="19"/>
+          <w:szCs w:val="19"/>
+          <w:shd w:val="clear" w:fill="202122"/>
+        </w:rPr>
+        <w:t>如需回滚，运行 git reset --hard 65593ea^ 即可回到上一个版本。</w:t>
+      </w:r>
+    </w:p>
+    <w:p>
+      <w:pPr>
+        <w:rPr>
+          <w:rFonts w:hint="eastAsia" w:ascii="Segoe UI" w:hAnsi="Segoe UI" w:eastAsia="Segoe UI" w:cs="Segoe UI"/>
+          <w:i w:val="0"/>
+          <w:iCs w:val="0"/>
+          <w:caps w:val="0"/>
+          <w:spacing w:val="0"/>
+          <w:sz w:val="19"/>
+          <w:szCs w:val="19"/>
+          <w:shd w:val="clear" w:fill="202122"/>
+        </w:rPr>
+      </w:pPr>
+      <w:bookmarkStart w:id="0" w:name="_GoBack"/>
+      <w:bookmarkEnd w:id="0"/>
+    </w:p>
+    <w:p>
+      <w:pPr>
+        <w:rPr>
+          <w:rFonts w:hint="default" w:ascii="Segoe UI" w:hAnsi="Segoe UI" w:eastAsia="Segoe UI" w:cs="Segoe UI"/>
+          <w:i w:val="0"/>
+          <w:iCs w:val="0"/>
+          <w:caps w:val="0"/>
+          <w:color w:val="48A0C7"/>
+          <w:spacing w:val="0"/>
+          <w:sz w:val="19"/>
+          <w:szCs w:val="19"/>
+          <w:shd w:val="clear" w:fill="191A1B"/>
+        </w:rPr>
+      </w:pPr>
+      <w:r>
+        <w:rPr>
+          <w:rFonts w:hint="eastAsia" w:ascii="Segoe UI" w:hAnsi="Segoe UI" w:eastAsia="宋体" w:cs="Segoe UI"/>
+          <w:i w:val="0"/>
+          <w:iCs w:val="0"/>
+          <w:caps w:val="0"/>
+          <w:color w:val="BFBFBF"/>
+          <w:spacing w:val="0"/>
+          <w:sz w:val="19"/>
+          <w:szCs w:val="19"/>
+          <w:shd w:val="clear" w:fill="191A1B"/>
+          <w:lang w:val="en-US" w:eastAsia="zh-CN"/>
+        </w:rPr>
+        <w:t>接口</w:t>
+      </w:r>
+      <w:r>
+        <w:rPr>
+          <w:rFonts w:ascii="Segoe UI" w:hAnsi="Segoe UI" w:eastAsia="Segoe UI" w:cs="Segoe UI"/>
+          <w:i w:val="0"/>
+          <w:iCs w:val="0"/>
+          <w:caps w:val="0"/>
+          <w:color w:val="BFBFBF"/>
+          <w:spacing w:val="0"/>
+          <w:sz w:val="19"/>
+          <w:szCs w:val="19"/>
+          <w:shd w:val="clear" w:fill="191A1B"/>
+        </w:rPr>
+        <w:t xml:space="preserve">文档已生成至 </w:t>
+      </w:r>
+      <w:r>
+        <w:rPr>
+          <w:rFonts w:hint="default" w:ascii="Segoe UI" w:hAnsi="Segoe UI" w:eastAsia="Segoe UI" w:cs="Segoe UI"/>
+          <w:i w:val="0"/>
+          <w:iCs w:val="0"/>
+          <w:caps w:val="0"/>
+          <w:color w:val="48A0C7"/>
+          <w:spacing w:val="0"/>
+          <w:sz w:val="19"/>
+          <w:szCs w:val="19"/>
+          <w:shd w:val="clear" w:fill="191A1B"/>
+        </w:rPr>
+        <w:fldChar w:fldCharType="begin"/>
+      </w:r>
+      <w:r>
+        <w:rPr>
+          <w:rFonts w:hint="default" w:ascii="Segoe UI" w:hAnsi="Segoe UI" w:eastAsia="Segoe UI" w:cs="Segoe UI"/>
+          <w:i w:val="0"/>
+          <w:iCs w:val="0"/>
+          <w:caps w:val="0"/>
+          <w:color w:val="48A0C7"/>
+          <w:spacing w:val="0"/>
+          <w:sz w:val="19"/>
+          <w:szCs w:val="19"/>
+          <w:shd w:val="clear" w:fill="191A1B"/>
+        </w:rPr>
+        <w:instrText xml:space="preserve"> HYPERLINK "vscode-webview://1ss8q3et1rguma5o7kfdsgj7lpuqgpq2f3t3ikdaa7v2vgcmu8j3/PLUGIN_API_SPECIFICATION.md" \t "_blank" </w:instrText>
+      </w:r>
+      <w:r>
+        <w:rPr>
+          <w:rFonts w:hint="default" w:ascii="Segoe UI" w:hAnsi="Segoe UI" w:eastAsia="Segoe UI" w:cs="Segoe UI"/>
+          <w:i w:val="0"/>
+          <w:iCs w:val="0"/>
+          <w:caps w:val="0"/>
+          <w:color w:val="48A0C7"/>
+          <w:spacing w:val="0"/>
+          <w:sz w:val="19"/>
+          <w:szCs w:val="19"/>
+          <w:shd w:val="clear" w:fill="191A1B"/>
+        </w:rPr>
+        <w:fldChar w:fldCharType="separate"/>
+      </w:r>
+      <w:r>
+        <w:rPr>
+          <w:rStyle w:val="6"/>
+          <w:rFonts w:hint="default" w:ascii="Segoe UI" w:hAnsi="Segoe UI" w:eastAsia="Segoe UI" w:cs="Segoe UI"/>
+          <w:i w:val="0"/>
+          <w:iCs w:val="0"/>
+          <w:caps w:val="0"/>
+          <w:color w:val="48A0C7"/>
+          <w:spacing w:val="0"/>
+          <w:sz w:val="19"/>
+          <w:szCs w:val="19"/>
+          <w:shd w:val="clear" w:fill="191A1B"/>
+        </w:rPr>
+        <w:t>PLUGIN_API_SPECIFICATION.md</w:t>
+      </w:r>
+      <w:r>
+        <w:rPr>
+          <w:rFonts w:hint="default" w:ascii="Segoe UI" w:hAnsi="Segoe UI" w:eastAsia="Segoe UI" w:cs="Segoe UI"/>
+          <w:i w:val="0"/>
+          <w:iCs w:val="0"/>
+          <w:caps w:val="0"/>
+          <w:color w:val="48A0C7"/>
+          <w:spacing w:val="0"/>
+          <w:sz w:val="19"/>
+          <w:szCs w:val="19"/>
+          <w:shd w:val="clear" w:fill="191A1B"/>
+        </w:rPr>
+        <w:fldChar w:fldCharType="end"/>
+      </w:r>
+    </w:p>
+    <w:p>
+      <w:pPr>
+        <w:rPr>
+          <w:color w:val="FFFFFF" w:themeColor="background1"/>
+          <w:highlight w:val="black"/>
+          <w14:textFill>
+            <w14:solidFill>
+              <w14:schemeClr w14:val="bg1"/>
+            </w14:solidFill>
+          </w14:textFill>
+        </w:rPr>
+      </w:pPr>
+      <w:r>
+        <w:rPr>
+          <w:rFonts w:hint="default"/>
+          <w:color w:val="FFFFFF" w:themeColor="background1"/>
+          <w:highlight w:val="black"/>
+          <w14:textFill>
+            <w14:solidFill>
+              <w14:schemeClr w14:val="bg1"/>
+            </w14:solidFill>
+          </w14:textFill>
+        </w:rPr>
+        <w:t>文档涵盖的章节：</w:t>
+      </w:r>
+    </w:p>
+    <w:p>
+      <w:pPr>
+        <w:rPr>
+          <w:color w:val="FFFFFF" w:themeColor="background1"/>
+          <w:highlight w:val="black"/>
+          <w14:textFill>
+            <w14:solidFill>
+              <w14:schemeClr w14:val="bg1"/>
+            </w14:solidFill>
+          </w14:textFill>
+        </w:rPr>
+      </w:pPr>
+      <w:r>
+        <w:rPr>
+          <w:rFonts w:hint="default"/>
+          <w:color w:val="FFFFFF" w:themeColor="background1"/>
+          <w:highlight w:val="black"/>
+          <w14:textFill>
+            <w14:solidFill>
+              <w14:schemeClr w14:val="bg1"/>
+            </w14:solidFill>
+          </w14:textFill>
+        </w:rPr>
+        <w:t xml:space="preserve">manifest.json — 定义了 </w:t>
+      </w:r>
+      <w:r>
+        <w:rPr>
+          <w:color w:val="FFFFFF" w:themeColor="background1"/>
+          <w:highlight w:val="black"/>
+          <w14:textFill>
+            <w14:solidFill>
+              <w14:schemeClr w14:val="bg1"/>
+            </w14:solidFill>
+          </w14:textFill>
+        </w:rPr>
+        <w:t>plugin_id</w:t>
+      </w:r>
+      <w:r>
+        <w:rPr>
+          <w:rFonts w:hint="default"/>
+          <w:color w:val="FFFFFF" w:themeColor="background1"/>
+          <w:highlight w:val="black"/>
+          <w14:textFill>
+            <w14:solidFill>
+              <w14:schemeClr w14:val="bg1"/>
+            </w14:solidFill>
+          </w14:textFill>
+        </w:rPr>
+        <w:t>、billing_type、frontend_entry、backend_api 等全部字段，提供两个完整 JSON 示例（免费插件 + 需配置的 Token 插件）</w:t>
+      </w:r>
+    </w:p>
+    <w:p>
+      <w:pPr>
+        <w:rPr>
+          <w:color w:val="FFFFFF" w:themeColor="background1"/>
+          <w:highlight w:val="black"/>
+          <w14:textFill>
+            <w14:solidFill>
+              <w14:schemeClr w14:val="bg1"/>
+            </w14:solidFill>
+          </w14:textFill>
+        </w:rPr>
+      </w:pPr>
+      <w:r>
+        <w:rPr>
+          <w:rFonts w:hint="default"/>
+          <w:color w:val="FFFFFF" w:themeColor="background1"/>
+          <w:highlight w:val="black"/>
+          <w14:textFill>
+            <w14:solidFill>
+              <w14:schemeClr w14:val="bg1"/>
+            </w14:solidFill>
+          </w14:textFill>
+        </w:rPr>
+        <w:t>后端接口规范 — POST {backend_api} 统一入口，请求头 X-Tenant-Id + Authorization，响应格式 { code, data, token_used, balance_remaining }，9 个标准错误码（40001–50003）</w:t>
+      </w:r>
+    </w:p>
+    <w:p>
+      <w:pPr>
+        <w:rPr>
+          <w:color w:val="FFFFFF" w:themeColor="background1"/>
+          <w:highlight w:val="black"/>
+          <w14:textFill>
+            <w14:solidFill>
+              <w14:schemeClr w14:val="bg1"/>
+            </w14:solidFill>
+          </w14:textFill>
+        </w:rPr>
+      </w:pPr>
+      <w:r>
+        <w:rPr>
+          <w:rFonts w:hint="default"/>
+          <w:color w:val="FFFFFF" w:themeColor="background1"/>
+          <w:highlight w:val="black"/>
+          <w14:textFill>
+            <w14:solidFill>
+              <w14:schemeClr w14:val="bg1"/>
+            </w14:solidFill>
+          </w14:textFill>
+        </w:rPr>
+        <w:t>前端嵌入规范 — iframe 隔离 + postMessage 双向通信，定义 INIT / THEME_CHANGE / INVOKE / INVOKE_RESULT / ERROR / PLUGIN_READY 六类消息，CSS 变量使用规范</w:t>
+      </w:r>
+    </w:p>
+    <w:p>
+      <w:pPr>
+        <w:rPr>
+          <w:color w:val="FFFFFF" w:themeColor="background1"/>
+          <w:highlight w:val="black"/>
+          <w14:textFill>
+            <w14:solidFill>
+              <w14:schemeClr w14:val="bg1"/>
+            </w14:solidFill>
+          </w14:textFill>
+        </w:rPr>
+      </w:pPr>
+      <w:r>
+        <w:rPr>
+          <w:rFonts w:hint="default"/>
+          <w:color w:val="FFFFFF" w:themeColor="background1"/>
+          <w:highlight w:val="black"/>
+          <w14:textFill>
+            <w14:solidFill>
+              <w14:schemeClr w14:val="bg1"/>
+            </w14:solidFill>
+          </w14:textFill>
+        </w:rPr>
+        <w:t>插件部署与注册 — 支持 Docker / 云函数 / 独立 HTTP 三种部署方式，完整注册流程（上传 → 解析 → 测试 → 上架）</w:t>
+      </w:r>
+    </w:p>
+    <w:p>
+      <w:pPr>
+        <w:rPr>
+          <w:color w:val="FFFFFF" w:themeColor="background1"/>
+          <w:highlight w:val="black"/>
+          <w14:textFill>
+            <w14:solidFill>
+              <w14:schemeClr w14:val="bg1"/>
+            </w14:solidFill>
+          </w14:textFill>
+        </w:rPr>
+      </w:pPr>
+      <w:r>
+        <w:rPr>
+          <w:rFonts w:hint="default"/>
+          <w:color w:val="FFFFFF" w:themeColor="background1"/>
+          <w:highlight w:val="black"/>
+          <w14:textFill>
+            <w14:solidFill>
+              <w14:schemeClr w14:val="bg1"/>
+            </w14:solidFill>
+          </w14:textFill>
+        </w:rPr>
+        <w:t>计费与权限 — 平台网关自动扣费流程，visible_to 角色可见性控制，required_role 调用权限，need_config 租户配置</w:t>
+      </w:r>
+    </w:p>
+    <w:p>
+      <w:pPr>
+        <w:rPr>
+          <w:color w:val="FFFFFF" w:themeColor="background1"/>
+          <w:highlight w:val="black"/>
+          <w14:textFill>
+            <w14:solidFill>
+              <w14:schemeClr w14:val="bg1"/>
+            </w14:solidFill>
+          </w14:textFill>
+        </w:rPr>
+      </w:pPr>
+      <w:r>
+        <w:rPr>
+          <w:rFonts w:hint="default"/>
+          <w:color w:val="FFFFFF" w:themeColor="background1"/>
+          <w:highlight w:val="black"/>
+          <w14:textFill>
+            <w14:solidFill>
+              <w14:schemeClr w14:val="bg1"/>
+            </w14:solidFill>
+          </w14:textFill>
+        </w:rPr>
+        <w:t>错误处理与日志 — 结构化日志格式（JSON），健康检查端点 /health</w:t>
+      </w:r>
+    </w:p>
+    <w:p>
+      <w:pPr>
+        <w:rPr>
+          <w:color w:val="FFFFFF" w:themeColor="background1"/>
+          <w:highlight w:val="black"/>
+          <w14:textFill>
+            <w14:solidFill>
+              <w14:schemeClr w14:val="bg1"/>
+            </w14:solidFill>
+          </w14:textFill>
+        </w:rPr>
+      </w:pPr>
+      <w:r>
+        <w:rPr>
+          <w:rFonts w:hint="default"/>
+          <w:color w:val="FFFFFF" w:themeColor="background1"/>
+          <w:highlight w:val="black"/>
+          <w14:textFill>
+            <w14:solidFill>
+              <w14:schemeClr w14:val="bg1"/>
+            </w14:solidFill>
+          </w14:textFill>
+        </w:rPr>
+        <w:t>附录 — 完整 Hello World 示例插件，包含 manifest.json、前端 index.html+style.css、后端 server.js+package.json + Dockerfile</w:t>
+      </w:r>
+    </w:p>
+    <w:p/>
+    <w:p>
+      <w:pPr>
+        <w:rPr>
+          <w:rFonts w:hint="eastAsia" w:ascii="Segoe UI" w:hAnsi="Segoe UI" w:eastAsia="Segoe UI" w:cs="Segoe UI"/>
+          <w:i w:val="0"/>
+          <w:iCs w:val="0"/>
+          <w:caps w:val="0"/>
+          <w:color w:val="48A0C7"/>
+          <w:spacing w:val="0"/>
+          <w:sz w:val="19"/>
+          <w:szCs w:val="19"/>
+          <w:shd w:val="clear" w:fill="191A1B"/>
+        </w:rPr>
+      </w:pPr>
+      <w:r>
+        <w:rPr>
+          <w:rFonts w:ascii="Segoe UI" w:hAnsi="Segoe UI" w:eastAsia="Segoe UI" w:cs="Segoe UI"/>
+          <w:i w:val="0"/>
+          <w:iCs w:val="0"/>
+          <w:caps w:val="0"/>
+          <w:color w:val="BFBFBF"/>
+          <w:spacing w:val="0"/>
+          <w:sz w:val="19"/>
+          <w:szCs w:val="19"/>
+          <w:shd w:val="clear" w:fill="191A1B"/>
+        </w:rPr>
+        <w:t xml:space="preserve">将“AI图片生成”插件，在项目目录中单独生成一个文件夹，现有代码按照 </w:t>
+      </w:r>
+      <w:r>
+        <w:rPr>
+          <w:rFonts w:hint="default" w:ascii="Segoe UI" w:hAnsi="Segoe UI" w:eastAsia="Segoe UI" w:cs="Segoe UI"/>
+          <w:i w:val="0"/>
+          <w:iCs w:val="0"/>
+          <w:caps w:val="0"/>
+          <w:color w:val="85B6FF"/>
+          <w:spacing w:val="0"/>
+          <w:sz w:val="19"/>
+          <w:szCs w:val="19"/>
+          <w:bdr w:val="none" w:color="auto" w:sz="0" w:space="0"/>
+        </w:rPr>
+        <w:t>@PLUGIN_API_SPECIFICATION.md</w:t>
+      </w:r>
+      <w:r>
+        <w:rPr>
+          <w:rFonts w:hint="default" w:ascii="Segoe UI" w:hAnsi="Segoe UI" w:eastAsia="Segoe UI" w:cs="Segoe UI"/>
+          <w:i w:val="0"/>
+          <w:iCs w:val="0"/>
+          <w:caps w:val="0"/>
+          <w:color w:val="BFBFBF"/>
+          <w:spacing w:val="0"/>
+          <w:sz w:val="19"/>
+          <w:szCs w:val="19"/>
+          <w:shd w:val="clear" w:fill="191A1B"/>
+        </w:rPr>
+        <w:t xml:space="preserve"> 接口文档规范审核、调整、完善、测试，最后打包。</w:t>
+      </w:r>
     </w:p>
     <w:sectPr>
       <w:pgSz w:w="11906" w:h="16838"/>
@@ -2231,12 +2644,30 @@
     </w:rPr>
   </w:style>
   <w:style w:type="character" w:styleId="5">
+    <w:name w:val="Strong"/>
+    <w:basedOn w:val="4"/>
+    <w:qFormat/>
+    <w:uiPriority w:val="0"/>
+    <w:rPr>
+      <w:b/>
+    </w:rPr>
+  </w:style>
+  <w:style w:type="character" w:styleId="6">
     <w:name w:val="Hyperlink"/>
     <w:basedOn w:val="4"/>
     <w:uiPriority w:val="0"/>
     <w:rPr>
       <w:color w:val="0000FF"/>
       <w:u w:val="single"/>
+    </w:rPr>
+  </w:style>
+  <w:style w:type="character" w:styleId="7">
+    <w:name w:val="HTML Code"/>
+    <w:basedOn w:val="4"/>
+    <w:uiPriority w:val="0"/>
+    <w:rPr>
+      <w:rFonts w:ascii="Courier New" w:hAnsi="Courier New"/>
+      <w:sz w:val="20"/>
     </w:rPr>
   </w:style>
 </w:styles>

</xml_diff>